<commit_message>
1st version of data wrangling (second half)
</commit_message>
<xml_diff>
--- a/Data Wrangling (second half).docx
+++ b/Data Wrangling (second half).docx
@@ -33,21 +33,7 @@
         <w:rPr>
           <w:rFonts w:ascii="Cambria" w:hAnsi="Cambria"/>
         </w:rPr>
-        <w:t xml:space="preserve">We will implement basic dataset validation checks to confirm that the final dataset is </w:t>
-      </w:r>
-      <w:proofErr w:type="gramStart"/>
-      <w:r>
-        <w:rPr>
-          <w:rFonts w:ascii="Cambria" w:hAnsi="Cambria"/>
-        </w:rPr>
-        <w:t>analysis-ready</w:t>
-      </w:r>
-      <w:proofErr w:type="gramEnd"/>
-      <w:r>
-        <w:rPr>
-          <w:rFonts w:ascii="Cambria" w:hAnsi="Cambria"/>
-        </w:rPr>
-        <w:t>. This includes verifying the presence of all columns required for analysis (outcome, demographics, selected laboratory predictors, and key identifiers) and confirming that each column has the expected data type (e.g., numeric, categorical/character where applicable). We will also conduct lightweight consistency checks, such as ensuring no duplicated encounter keys, screening for implausible values (e.g., negative age or BMI)</w:t>
+        <w:t>We will implement basic dataset validation checks to confirm that the final dataset is analysis-ready. This includes verifying the presence of all columns required for analysis (outcome, demographics, selected laboratory predictors, and key identifiers) and confirming that each column has the expected data type (e.g., numeric, categorical/character where applicable). We will also conduct lightweight consistency checks, such as ensuring no duplicated encounter keys, screening for implausible values (e.g., negative age or BMI)</w:t>
       </w:r>
       <w:r>
         <w:rPr>
@@ -120,21 +106,7 @@
         <w:rPr>
           <w:rFonts w:ascii="Cambria" w:hAnsi="Cambria"/>
         </w:rPr>
-        <w:t>After validating the final dataset, we will construct the modeling cohort by retaining all encounters labeled as hypoxemia and randomly sampling an equal number of non-</w:t>
-      </w:r>
-      <w:proofErr w:type="gramStart"/>
-      <w:r>
-        <w:rPr>
-          <w:rFonts w:ascii="Cambria" w:hAnsi="Cambria"/>
-        </w:rPr>
-        <w:t>hypoxemia</w:t>
-      </w:r>
-      <w:proofErr w:type="gramEnd"/>
-      <w:r>
-        <w:rPr>
-          <w:rFonts w:ascii="Cambria" w:hAnsi="Cambria"/>
-        </w:rPr>
-        <w:t xml:space="preserve"> encounters to form a balanced dataset for analysis. We will then split this cohort into training (70%) and test (30%) sets. The training set will be used for exploratory analyses</w:t>
+        <w:t>After validating the final dataset, we will construct the modeling cohort by retaining all encounters labeled as hypoxemia and randomly sampling an equal number of non-hypoxemia encounters to form a balanced dataset for analysis. We will then split this cohort into training (70%) and test (30%) sets. The training set will be used for exploratory analyses</w:t>
       </w:r>
       <w:r>
         <w:rPr>
@@ -370,21 +342,7 @@
         <w:rPr>
           <w:rFonts w:ascii="Cambria" w:hAnsi="Cambria"/>
         </w:rPr>
-        <w:t xml:space="preserve">with postoperative hypoxemia as the binary outcome and the full set of candidate predictors (demographics and selected laboratory predictors) as independent </w:t>
-      </w:r>
-      <w:proofErr w:type="gramStart"/>
-      <w:r>
-        <w:rPr>
-          <w:rFonts w:ascii="Cambria" w:hAnsi="Cambria"/>
-        </w:rPr>
-        <w:t>variables, and</w:t>
-      </w:r>
-      <w:proofErr w:type="gramEnd"/>
-      <w:r>
-        <w:rPr>
-          <w:rFonts w:ascii="Cambria" w:hAnsi="Cambria"/>
-        </w:rPr>
-        <w:t xml:space="preserve"> identify </w:t>
+        <w:t xml:space="preserve">with postoperative hypoxemia as the binary outcome and the full set of candidate predictors (demographics and selected laboratory predictors) as independent variables, and identify </w:t>
       </w:r>
       <w:r>
         <w:rPr>
@@ -461,21 +419,7 @@
         <w:rPr>
           <w:rFonts w:ascii="Cambria" w:hAnsi="Cambria"/>
         </w:rPr>
-        <w:t xml:space="preserve"> using only the significant predictors identified in Research Question </w:t>
-      </w:r>
-      <w:proofErr w:type="gramStart"/>
-      <w:r>
-        <w:rPr>
-          <w:rFonts w:ascii="Cambria" w:hAnsi="Cambria"/>
-        </w:rPr>
-        <w:t>1, and</w:t>
-      </w:r>
-      <w:proofErr w:type="gramEnd"/>
-      <w:r>
-        <w:rPr>
-          <w:rFonts w:ascii="Cambria" w:hAnsi="Cambria"/>
-        </w:rPr>
-        <w:t xml:space="preserve"> evaluate predictive performance on the test set.</w:t>
+        <w:t xml:space="preserve"> using only the significant predictors identified in Research Question 1, and evaluate predictive performance on the test set.</w:t>
       </w:r>
       <w:r>
         <w:rPr>
@@ -582,49 +526,14 @@
         <w:rPr>
           <w:rFonts w:ascii="Cambria" w:hAnsi="Cambria"/>
         </w:rPr>
-        <w:t xml:space="preserve"> analytic dataset. The script will then generate and save EDA figures as .</w:t>
-      </w:r>
-      <w:proofErr w:type="spellStart"/>
-      <w:r>
-        <w:rPr>
-          <w:rFonts w:ascii="Cambria" w:hAnsi="Cambria"/>
-        </w:rPr>
-        <w:t>png</w:t>
-      </w:r>
-      <w:proofErr w:type="spellEnd"/>
-      <w:r>
-        <w:rPr>
-          <w:rFonts w:ascii="Cambria" w:hAnsi="Cambria"/>
-        </w:rPr>
-        <w:t xml:space="preserve"> files, fit the logistic regression models, and save key outputs</w:t>
-      </w:r>
-      <w:r>
-        <w:rPr>
-          <w:rFonts w:ascii="Cambria" w:hAnsi="Cambria"/>
-        </w:rPr>
-        <w:t xml:space="preserve"> including (</w:t>
-      </w:r>
-      <w:proofErr w:type="spellStart"/>
-      <w:r>
-        <w:rPr>
-          <w:rFonts w:ascii="Cambria" w:hAnsi="Cambria"/>
-        </w:rPr>
-        <w:t>i</w:t>
-      </w:r>
-      <w:proofErr w:type="spellEnd"/>
-      <w:r>
-        <w:rPr>
-          <w:rFonts w:ascii="Cambria" w:hAnsi="Cambria"/>
-        </w:rPr>
-        <w:t>) a .csv file containing the estimated coefficients and Wald test p-values from the Research Question 1 (full) model, and (ii) a .txt file reporting the test-set misclassification error rate for the Research Question 2 (reduced) model.</w:t>
-      </w:r>
-    </w:p>
-    <w:p>
-      <w:pPr>
-        <w:rPr>
-          <w:rFonts w:ascii="Cambria" w:hAnsi="Cambria"/>
-        </w:rPr>
-      </w:pPr>
+        <w:t xml:space="preserve"> analytic dataset. The script will then generate and save EDA figures as .png files, fit the logistic regression models, and save key outputs</w:t>
+      </w:r>
+      <w:r>
+        <w:rPr>
+          <w:rFonts w:ascii="Cambria" w:hAnsi="Cambria"/>
+        </w:rPr>
+        <w:t xml:space="preserve"> including (i) a .csv file containing the estimated coefficients and Wald test p-values from the Research Question 1 (full) model, and (ii) a .txt file reporting the test-set misclassification error rate for the Research Question 2 (reduced) model.</w:t>
+      </w:r>
     </w:p>
     <w:sectPr>
       <w:pgSz w:w="11906" w:h="16838"/>

</xml_diff>